<commit_message>
Consolidate API image build as Stage 8
</commit_message>
<xml_diff>
--- a/docs/deal-and-drive-pipeline-guide.docx
+++ b/docs/deal-and-drive-pipeline-guide.docx
@@ -1056,13 +1056,7 @@
               <w:spacing w:after="20"/>
             </w:pPr>
             <w:r>
-              <w:rPr>
-                <w:rFonts w:ascii="Arial" w:hAnsi="Arial"/>
-                <w:b w:val="0"/>
-                <w:color w:val="17324D"/>
-                <w:sz w:val="16"/>
-              </w:rPr>
-              <w:t>On a PR, builds without publishing. On a push to dev, builds and pushes an immutable Git-SHA tag to ECR. The React frontend is static and is not containerized.</w:t>
+              <w:t>One visible Stage 8 job builds the API Docker image for both events. On pull requests it builds without publishing; on pushes to dev it authenticates to ECR and publishes an immutable commit-SHA tag. The React frontend is static and is not containerized.</w:t>
             </w:r>
           </w:p>
         </w:tc>

</xml_diff>